<commit_message>
chore: remove arquivos do prova1 enviados por engano para cecil.ia
</commit_message>
<xml_diff>
--- a/Prof. Rafael/Produtos/ebook - Gestao de sala de aula sem caos.docx
+++ b/Prof. Rafael/Produtos/ebook - Gestao de sala de aula sem caos.docx
@@ -8,7 +8,7 @@
         <ns0:jc ns0:val="center"/>
       </ns0:pPr>
       <ns0:r>
-        <ns0:t>Sala de aula sob controle</ns0:t>
+        <ns0:t>Gestão de sala de aula sem caos</ns0:t>
       </ns0:r>
     </ns0:p>
     <ns0:p ns2:paraId="0F2CEC84">
@@ -82,7 +82,7 @@
     </ns0:p>
     <ns0:p ns2:paraId="77F4F7B3">
       <ns0:r>
-        <ns0:t>Título: Sala de aula sob controle: manual para aulas de 45 minutos com alta aprendizagem e menos estresse.</ns0:t>
+        <ns0:t>Título: Gestão de sala de aula sem caos: 40 protocolos práticos para reduzir a indisciplina no dia a dia.</ns0:t>
       </ns0:r>
     </ns0:p>
     <ns0:p ns2:paraId="1CC71ED7">
@@ -138,7 +138,7 @@
         <ns0:spacing ns0:after="120"/>
       </ns0:pPr>
       <ns0:r>
-        <ns0:t>Distribuição oficial dos 40 capítulos</ns0:t>
+        <ns0:t>Distribuição oficial dos ~40 protocolos</ns0:t>
       </ns0:r>
     </ns0:p>
     <ns0:p>
@@ -774,7 +774,7 @@
     </ns0:p>
     <ns0:p>
       <ns0:r>
-        <ns0:t>Nota editorial: o sumário acima já reflete a arquitetura oficial de 40 capítulos. O corpo abaixo ainda preserva um rascunho de trabalho anterior e será reestruturado ao longo da consolidação do livro.</ns0:t>
+        <ns0:t>Nota editorial: o sumário acima já reflete a arquitetura oficial de 6 capítulos e ~40 protocolos. O corpo abaixo ainda preserva um rascunho de trabalho anterior e será reestruturado ao longo da consolidação do livro.</ns0:t>
       </ns0:r>
     </ns0:p>
     <ns0:p ns2:paraId="722B4519">
@@ -1002,6 +1002,105 @@
     <ns0:p ns2:paraId="0730A417"/>
     <ns0:p>
       <ns0:pPr>
+        <ns0:pStyle ns0:val="Heading2"/>
+      </ns0:pPr>
+      <ns0:r>
+        <ns0:rPr>
+          <ns0:b/>
+        </ns0:rPr>
+        <ns0:t>6. Protocolo do sinal mestre para silêncio</ns0:t>
+      </ns0:r>
+    </ns0:p>
+    <ns0:p>
+      <ns0:r>
+        <ns0:t>Situação: a turma fala por cima da instrução e cada novo pedido de silêncio custa energia.</ns0:t>
+      </ns0:r>
+    </ns0:p>
+    <ns0:p>
+      <ns0:r>
+        <ns0:t>Protocolo seco: usar um único sinal combinado para pausar a sala e retomar o foco sem repetir a ordem em voz alta.</ns0:t>
+      </ns0:r>
+    </ns0:p>
+    <ns0:p>
+      <ns0:r>
+        <ns0:t>O que evitar: falar por cima do ruído, inventar sinais diferentes a cada dia ou transformar o pedido de silêncio em disputa de volume.</ns0:t>
+      </ns0:r>
+    </ns0:p>
+    <ns0:p>
+      <ns0:r>
+        <ns0:t>Ideia central: o silêncio precisa virar comando visível, curto e previsível.</ns0:t>
+      </ns0:r>
+    </ns0:p>
+    <ns0:p>
+      <ns0:r/>
+    </ns0:p>
+    <ns0:p>
+      <ns0:pPr>
+        <ns0:pStyle ns0:val="Heading2"/>
+      </ns0:pPr>
+      <ns0:r>
+        <ns0:rPr>
+          <ns0:b/>
+        </ns0:rPr>
+        <ns0:t>7. Protocolo de delegação de tarefas e ajudantes da classe</ns0:t>
+      </ns0:r>
+    </ns0:p>
+    <ns0:p>
+      <ns0:r>
+        <ns0:t>Situação: o professor tenta fazer tudo sozinho e perde tempo em tarefas operacionais que poderiam ser distribuídas.</ns0:t>
+      </ns0:r>
+    </ns0:p>
+    <ns0:p>
+      <ns0:r>
+        <ns0:t>Protocolo seco: repartir funções simples e claras para a turma, com ajudantes da classe e pequenas rotinas de apoio.</ns0:t>
+      </ns0:r>
+    </ns0:p>
+    <ns0:p>
+      <ns0:r>
+        <ns0:t>O que evitar: transformar ajudantes em prêmio simbólico sem função real ou criar cargos que só geram disputa social.</ns0:t>
+      </ns0:r>
+    </ns0:p>
+    <ns0:p>
+      <ns0:r>
+        <ns0:t>Ideia central: liderança forte também sabe canalizar responsabilidade para a turma.</ns0:t>
+      </ns0:r>
+    </ns0:p>
+    <ns0:p>
+      <ns0:r/>
+    </ns0:p>
+    <ns0:p>
+      <ns0:pPr>
+        <ns0:pStyle ns0:val="Heading2"/>
+      </ns0:pPr>
+      <ns0:r>
+        <ns0:rPr>
+          <ns0:b/>
+        </ns0:rPr>
+        <ns0:t>8. Protocolo de fechamento da aula: limpeza e saída organizada</ns0:t>
+      </ns0:r>
+    </ns0:p>
+    <ns0:p>
+      <ns0:r>
+        <ns0:t>Situação: a aula termina em desordem, com material espalhado, barulho e saída sem comando.</ns0:t>
+      </ns0:r>
+    </ns0:p>
+    <ns0:p>
+      <ns0:r>
+        <ns0:t>Protocolo seco: reservar um fechamento curto para limpeza, recolhimento, revisão final e saída sob orientação docente.</ns0:t>
+      </ns0:r>
+    </ns0:p>
+    <ns0:p>
+      <ns0:r>
+        <ns0:t>O que evitar: deixar o fim da aula ao acaso ou aceitar que o encerramento seja o momento em que a turma devolve o caos para o corredor.</ns0:t>
+      </ns0:r>
+    </ns0:p>
+    <ns0:p>
+      <ns0:r>
+        <ns0:t>Ideia central: uma boa aula termina com a mesma clareza com que começou.</ns0:t>
+      </ns0:r>
+    </ns0:p>
+    <ns0:p>
+      <ns0:pPr>
         <ns0:pStyle ns0:val="Heading1"/>
       </ns0:pPr>
       <ns0:r>
@@ -1027,12 +1126,12 @@
     </ns0:p>
     <ns0:p>
       <ns0:r>
-        <ns0:t>Este capítulo cria a base preventiva para que a indisciplina apareça menos e com menos intensidade. A função dele é preparar a sala para funcionar antes que o conflito apareça, com menos improviso e mais previsibilidade.</ns0:t>
-      </ns0:r>
-    </ns0:p>
-    <ns0:p>
-      <ns0:r>
-        <ns0:t>Os 8 subcapítulos a seguir cobrem desde a definição do que é sucesso até a construção de uma comunidade onde o erro é aceito como parte do aprendizado.</ns0:t>
+        <ns0:t>Este capítulo prepara a sala para funcionar antes que o conflito apareça. A lógica aqui é preventiva: instalar previsibilidade, reduzir improviso e diminuir a chance de a indisciplina ganhar espaço.</ns0:t>
+      </ns0:r>
+    </ns0:p>
+    <ns0:p>
+      <ns0:r>
+        <ns0:t>Os 8 temas-candidatos do mapa editorial se condensam aqui em 6 protocolos finais. A ideia não é explicar tudo de novo, e sim oferecer os blocos mais fortes para que a prevenção seja prática, clara e fácil de aplicar.</ns0:t>
       </ns0:r>
     </ns0:p>
     <ns0:p>
@@ -1046,12 +1145,12 @@
         <ns0:rPr>
           <ns0:b/>
         </ns0:rPr>
-        <ns0:t>2.1 — Deixe claro o que "sucesso" significa</ns0:t>
-      </ns0:r>
-    </ns0:p>
-    <ns0:p>
-      <ns0:r>
-        <ns0:t>Tese central: regras positivas + contrato social. A importância de dar opção para o aluno escolher o comportamento. É mais fácil e efetivo conduzir para o acerto do que tentar bloquear o errado. Reforçar os bons modelos. Elogio público, crítica privada como regra geral.</ns0:t>
+        <ns0:t>2.1 — Regras positivas e contrato social</ns0:t>
+      </ns0:r>
+    </ns0:p>
+    <ns0:p>
+      <ns0:r>
+        <ns0:t>Regras positivas dão direção concreta para o comportamento e o contrato social transforma expectativa em pacto de convivio. O professor conduz para o acerto, reforça bons modelos e usa elogio publico com critica privada como regra geral.</ns0:t>
       </ns0:r>
     </ns0:p>
     <ns0:p>
@@ -1070,12 +1169,12 @@
         <ns0:rPr>
           <ns0:b/>
         </ns0:rPr>
-        <ns0:t>2.2 — Mais um pouco sobre rotinas</ns0:t>
-      </ns0:r>
-    </ns0:p>
-    <ns0:p>
-      <ns0:r>
-        <ns0:t>Tese central: rotinas metodológicas durante o processo de ensino, não apenas rotinas de comportamento. Estrutura de aula por partes (objetivo no quadro, atividades visíveis, chamada musical, hora da novidade). Comum na pedagogia e na escola normal, mas raramente abordado nas licenciaturas.</ns0:t>
+        <ns0:t>2.2 — Primeiras duas semanas / boot camp preventivo</ns0:t>
+      </ns0:r>
+    </ns0:p>
+    <ns0:p>
+      <ns0:r>
+        <ns0:t>As duas primeiras semanas são a janela de maior alavanca: enquanto os alunos ainda estão se reconhecendo, o professor treina rotinas, transicoes e comandos para mostrar pela experiencia como a aula funciona.</ns0:t>
       </ns0:r>
     </ns0:p>
     <ns0:p>
@@ -1094,12 +1193,12 @@
         <ns0:rPr>
           <ns0:b/>
         </ns0:rPr>
-        <ns0:t>2.3 — Defina o que é "ordem" para cada tipo de atividade</ns0:t>
-      </ns0:r>
-    </ns0:p>
-    <ns0:p>
-      <ns0:r>
-        <ns0:t>Tese central: ordem variável por tipo de atividade. Cada atividade demanda um estado mental diferente (Vygotsky, nível ótimo de desafio). A aula precisa de diversidade de momentos. Definir o que é 'ordem' para explicação, exercício, grupo, apresentação. Não é razoável esperar que alunos fiquem sentados e imóveis durante 45 minutos.</ns0:t>
+        <ns0:t>2.3 — Vigilancia multifocal + proximidade ativa</ns0:t>
+      </ns0:r>
+    </ns0:p>
+    <ns0:p>
+      <ns0:r>
+        <ns0:t>O professor percebe o que acontece em toda a sala enquanto ensina e circula com intencao para reduzir zonas de risco. A liderança aparece na circulacao, na ocupacao do espaco e na vigilancia calma.</ns0:t>
       </ns0:r>
     </ns0:p>
     <ns0:p>
@@ -1118,12 +1217,12 @@
         <ns0:rPr>
           <ns0:b/>
         </ns0:rPr>
-        <ns0:t>2.4 — Use a sua vantagem</ns0:t>
-      </ns0:r>
-    </ns0:p>
-    <ns0:p>
-      <ns0:r>
-        <ns0:t>Tese central: treinamento de rotinas iniciais — as primeiras duas semanas como janela estratégica. Enquanto os alunos estão se reconhecendo, o professor mostra pela experiência o que é uma aula ideal. Treinar rotinas, transições e comandos. Isso não elimina a necessidade de reforçar regras o ano todo.</ns0:t>
+        <ns0:t>2.4 — Overlapping + transições suaves</ns0:t>
+      </ns0:r>
+    </ns0:p>
+    <ns0:p>
+      <ns0:r>
+        <ns0:t>O professor administra uma demanda sem quebrar a outra e passa de uma atividade a outra sem vácuo. O foco e a continuidade precisam andar juntos para a aula não virar tempo morto.</ns0:t>
       </ns0:r>
     </ns0:p>
     <ns0:p>
@@ -1142,12 +1241,12 @@
         <ns0:rPr>
           <ns0:b/>
         </ns0:rPr>
-        <ns0:t>2.5 — O lado territorial da liderança em sala de aula</ns0:t>
-      </ns0:r>
-    </ns0:p>
-    <ns0:p>
-      <ns0:r>
-        <ns0:t>Tese central: vigilância multifocal + proximidade ativa. Presença calma e assertiva, não agressiva. Ocupação intencional do espaço. Territórios se formam naturalmente; o líder precisa administrá-los. A liderança não acontece dizendo 'eu sou o líder'; acontece através da presença.</ns0:t>
+        <ns0:t>2.5 — Wait-time + momentum</ns0:t>
+      </ns0:r>
+    </ns0:p>
+    <ns0:p>
+      <ns0:r>
+        <ns0:t>O professor da tempo real para pensar e sustenta o fluxo da aula sem pausas improdutivas. Espera produtiva e continuidade são as duas metades do mesmo controle de ritmo.</ns0:t>
       </ns0:r>
     </ns0:p>
     <ns0:p>
@@ -1166,12 +1265,12 @@
         <ns0:rPr>
           <ns0:b/>
         </ns0:rPr>
-        <ns0:t>2.6 — Não demande atenção desnecessariamente, mas quando demandar garanta uma aula com "bom ritmo"</ns0:t>
-      </ns0:r>
-    </ns0:p>
-    <ns0:p>
-      <ns0:r>
-        <ns0:t>Tese central: economia da atenção. Não chamar a turma toda para questão de 3 alunos. Pacing (Basil Bernstein): quanto tempo em cada atividade, ritmo de avanço, transições fluidas. Overlapping: administrar múltiplas demandas ao mesmo tempo. Comparação com stand-up comedy: manter ritmo e fluência.</ns0:t>
+        <ns0:t>2.6 — Demanda acadêmica + pertencimento/clima</ns0:t>
+      </ns0:r>
+    </ns0:p>
+    <ns0:p>
+      <ns0:r>
+        <ns0:t>A tarefa precisa estar no ponto certo e a turma precisa sentir que pertence a uma comunidade de aprendizagem. A prevenção aqui une desafio cognitivo, segurança psicológica e baixo medo de errar.</ns0:t>
       </ns0:r>
     </ns0:p>
     <ns0:p>
@@ -1184,23 +1283,18 @@
     </ns0:p>
     <ns0:p>
       <ns0:pPr>
-        <ns0:pStyle ns0:val="Heading2"/>
-      </ns0:pPr>
-      <ns0:r>
-        <ns0:rPr>
-          <ns0:b/>
-        </ns0:rPr>
-        <ns0:t>2.7 — Use perguntas de modo estratégico</ns0:t>
-      </ns0:r>
-    </ns0:p>
-    <ns0:p>
-      <ns0:r>
-        <ns0:t>Tese central: perguntas como ferramenta de engajamento e criação de imagens mentais. Perguntas abertas vs. fechadas. Resposta coral e dinâmicas rítmicas. Avaliação formativa em tempo real. BrainNet (Miguel Nicolelis): cérebros conectados no mesmo tema.</ns0:t>
-      </ns0:r>
-    </ns0:p>
-    <ns0:p>
-      <ns0:r>
-        <ns0:t>[Aguardando redação final — gatilho: 'registrar no livro']</ns0:t>
+        <ns0:pStyle ns0:val="Heading1"/>
+      </ns0:pPr>
+      <ns0:r>
+        <ns0:rPr>
+          <ns0:b/>
+        </ns0:rPr>
+        <ns0:t>Capítulo 3 — Gestão do fluxo da aula</ns0:t>
+      </ns0:r>
+    </ns0:p>
+    <ns0:p>
+      <ns0:r>
+        <ns0:t>[Estrutura de subcapítulos a definir — ver GUIA_OFICIAL_40_PROTOCOLOS.md]</ns0:t>
       </ns0:r>
     </ns0:p>
     <ns0:p>
@@ -1208,23 +1302,18 @@
     </ns0:p>
     <ns0:p>
       <ns0:pPr>
-        <ns0:pStyle ns0:val="Heading2"/>
-      </ns0:pPr>
-      <ns0:r>
-        <ns0:rPr>
-          <ns0:b/>
-        </ns0:rPr>
-        <ns0:t>2.8 — Construa uma comunidade onde as pessoas se sentem seguras o suficiente para reconhecer erros e se expressar</ns0:t>
-      </ns0:r>
-    </ns0:p>
-    <ns0:p>
-      <ns0:r>
-        <ns0:t>Tese central: segurança psicológica para aprender. Sem erro reconhecido → sem aprendizagem. Estado mental estável e previsível do líder. Não pessoalizar relações. Tratar todos sob as mesmas regras. Defender o direito de expressão. Diversidade de perspectivas como valor educacional.</ns0:t>
-      </ns0:r>
-    </ns0:p>
-    <ns0:p>
-      <ns0:r>
-        <ns0:t>[Aguardando redação final — gatilho: 'registrar no livro']</ns0:t>
+        <ns0:pStyle ns0:val="Heading1"/>
+      </ns0:pPr>
+      <ns0:r>
+        <ns0:rPr>
+          <ns0:b/>
+        </ns0:rPr>
+        <ns0:t>Capítulo 4 — Correção e desescalada</ns0:t>
+      </ns0:r>
+    </ns0:p>
+    <ns0:p>
+      <ns0:r>
+        <ns0:t>[Estrutura de subcapítulos a definir — ver GUIA_OFICIAL_40_PROTOCOLOS.md]</ns0:t>
       </ns0:r>
     </ns0:p>
     <ns0:p>
@@ -1238,7 +1327,7 @@
         <ns0:rPr>
           <ns0:b/>
         </ns0:rPr>
-        <ns0:t>Capítulo 3 — Gestão do fluxo da aula</ns0:t>
+        <ns0:t>Capítulo 5 — Relação e clima</ns0:t>
       </ns0:r>
     </ns0:p>
     <ns0:p>
@@ -1257,7 +1346,7 @@
         <ns0:rPr>
           <ns0:b/>
         </ns0:rPr>
-        <ns0:t>Capítulo 4 — Correção e desescalada</ns0:t>
+        <ns0:t>Capítulo 6 — Família, equipe e apoio externo</ns0:t>
       </ns0:r>
     </ns0:p>
     <ns0:p>
@@ -1269,183 +1358,28 @@
       <ns0:r/>
     </ns0:p>
     <ns0:p>
-      <ns0:pPr>
-        <ns0:pStyle ns0:val="Heading1"/>
-      </ns0:pPr>
-      <ns0:r>
-        <ns0:rPr>
-          <ns0:b/>
-        </ns0:rPr>
-        <ns0:t>Capítulo 5 — Relação e clima</ns0:t>
-      </ns0:r>
-    </ns0:p>
-    <ns0:p>
-      <ns0:r>
-        <ns0:t>[Estrutura de subcapítulos a definir — ver GUIA_OFICIAL_40_PROTOCOLOS.md]</ns0:t>
-      </ns0:r>
-    </ns0:p>
-    <ns0:p>
-      <ns0:r/>
-    </ns0:p>
-    <ns0:p>
-      <ns0:pPr>
-        <ns0:pStyle ns0:val="Heading1"/>
-      </ns0:pPr>
-      <ns0:r>
-        <ns0:rPr>
-          <ns0:b/>
-        </ns0:rPr>
-        <ns0:t>Capítulo 6 — Família, equipe e apoio externo</ns0:t>
-      </ns0:r>
-    </ns0:p>
-    <ns0:p>
-      <ns0:r>
-        <ns0:t>[Estrutura de subcapítulos a definir — ver GUIA_OFICIAL_40_PROTOCOLOS.md]</ns0:t>
-      </ns0:r>
-    </ns0:p>
-    <ns0:p>
-      <ns0:r/>
-    </ns0:p>
-    <ns0:p>
       <ns0:r>
         <ns0:t>Nota de continuidade: os capítulos 3 a 40 serão escritos a partir do mapa editorial oficial. O corpo antigo foi removido deste rascunho para evitar conflito com a nova arquitetura.</ns0:t>
       </ns0:r>
     </ns0:p>
-    <ns0:p ns2:paraId="146556D3">
-      <ns0:pPr>
-        <ns0:spacing ns0:before="120" ns0:after="120"/>
-      </ns0:pPr>
-      <ns0:r>
-        <ns0:rPr>
-          <ns0:b/>
-          <ns0:sz ns0:val="28"/>
-          <ns0:szCs ns0:val="28"/>
-        </ns0:rPr>
+    <ns0:p>
+      <ns0:r>
         <ns0:t>Referências</ns0:t>
       </ns0:r>
     </ns0:p>
-    <ns0:p ns2:paraId="4C7074A6">
-      <ns0:pPr>
-        <ns0:spacing ns0:before="120" ns0:after="120"/>
-      </ns0:pPr>
-      <ns0:r>
-        <ns0:rPr>
-          <ns0:b/>
-          <ns0:sz ns0:val="22"/>
-          <ns0:szCs ns0:val="22"/>
-        </ns0:rPr>
+    <ns0:p>
+      <ns0:r>
         <ns0:t>Base interna do projeto</ns0:t>
       </ns0:r>
     </ns0:p>
-    <ns0:p ns2:paraId="3D008B82">
-      <ns0:pPr>
-        <ns0:spacing ns0:after="60"/>
-        <ns0:ind ns0:left="720"/>
-      </ns0:pPr>
+    <ns0:p>
       <ns0:r>
         <ns0:t>- Banco de Perguntas da Audiencia - Professor Rafael.</ns0:t>
       </ns0:r>
     </ns0:p>
-    <ns0:p ns2:paraId="1169C67D">
-      <ns0:pPr>
-        <ns0:spacing ns0:after="60"/>
-        <ns0:ind ns0:left="720"/>
-      </ns0:pPr>
+    <ns0:p>
       <ns0:r>
         <ns0:t>- Historico de Analises da Base de Dados - Professor Rafael.</ns0:t>
-      </ns0:r>
-    </ns0:p>
-    <ns0:p ns2:paraId="641F064C">
-      <ns0:pPr>
-        <ns0:spacing ns0:after="60"/>
-        <ns0:ind ns0:left="720"/>
-      </ns0:pPr>
-      <ns0:r>
-        <ns0:t>- Frame do Negocio - Professor Rafael.</ns0:t>
-      </ns0:r>
-    </ns0:p>
-    <ns0:p ns2:paraId="5CC4D8F6">
-      <ns0:pPr>
-        <ns0:spacing ns0:after="60"/>
-        <ns0:ind ns0:left="720"/>
-      </ns0:pPr>
-      <ns0:r>
-        <ns0:t>- Biblioteca de Series YouTube - Professor Rafael.</ns0:t>
-      </ns0:r>
-    </ns0:p>
-    <ns0:p ns2:paraId="1CC39549">
-      <ns0:pPr>
-        <ns0:spacing ns0:before="120" ns0:after="120"/>
-      </ns0:pPr>
-      <ns0:r>
-        <ns0:t>Referências do Protocolo 1</ns0:t>
-      </ns0:r>
-    </ns0:p>
-    <ns0:p>
-      <ns0:pPr>
-        <ns0:spacing ns0:after="60"/>
-        <ns0:ind ns0:left="720"/>
-      </ns0:pPr>
-      <ns0:r>
-        <ns0:t>ALLDAY, R. A.; PAKURAR, K. Effects of teacher greetings on student on-task behavior. Journal of Applied Behavior Analysis, v. 40, n. 2, p. 317-320, 2007. https://doi.org/10.1901/jaba.2007.86-06</ns0:t>
-      </ns0:r>
-    </ns0:p>
-    <ns0:p>
-      <ns0:pPr>
-        <ns0:spacing ns0:after="60"/>
-        <ns0:ind ns0:left="720"/>
-      </ns0:pPr>
-      <ns0:r>
-        <ns0:t>ALLDAY, R. A.; BUSH, M.; TICKNOR, N.; WALKER, L. Using teacher greetings to increase speed to task engagement. Journal of Applied Behavior Analysis, v. 44, n. 2, p. 393-396, 2011. https://doi.org/10.1901/jaba.2011.44-393</ns0:t>
-      </ns0:r>
-    </ns0:p>
-    <ns0:p>
-      <ns0:pPr>
-        <ns0:spacing ns0:after="60"/>
-        <ns0:ind ns0:left="720"/>
-      </ns0:pPr>
-      <ns0:r>
-        <ns0:t>SIMONSEN, B.; FAIRBANKS, S.; BRIESCH, A.; MYERS, D.; SUGAI, G. Evidence-based practices in classroom management: considerations for research to practice. Education and Treatment of Children, v. 31, n. 3, p. 351-380, 2008. https://doi.org/10.1353/etc.0.0007</ns0:t>
-      </ns0:r>
-    </ns0:p>
-    <ns0:p ns2:paraId="69323A7A">
-      <ns0:pPr>
-        <ns0:spacing ns0:before="120" ns0:after="120"/>
-      </ns0:pPr>
-      <ns0:r>
-        <ns0:rPr>
-          <ns0:b/>
-          <ns0:sz ns0:val="22"/>
-          <ns0:szCs ns0:val="22"/>
-        </ns0:rPr>
-        <ns0:t>Referências de apoio</ns0:t>
-      </ns0:r>
-    </ns0:p>
-    <ns0:p ns2:paraId="299AAC79">
-      <ns0:pPr>
-        <ns0:spacing ns0:after="60"/>
-        <ns0:ind ns0:left="720"/>
-      </ns0:pPr>
-      <ns0:r>
-        <ns0:t>- Hattie, John. Visible Learning: A Synthesis of Over 800 Meta-Analyses Relating to Achievement. Routledge.</ns0:t>
-      </ns0:r>
-    </ns0:p>
-    <ns0:p ns2:paraId="72C5B8E1">
-      <ns0:pPr>
-        <ns0:spacing ns0:after="60"/>
-        <ns0:ind ns0:left="720"/>
-      </ns0:pPr>
-      <ns0:r>
-        <ns0:t>- OECD. Reports on teacher well-being, learning environments and classroom climate.</ns0:t>
-      </ns0:r>
-    </ns0:p>
-    <ns0:p ns2:paraId="6F0B6525">
-      <ns0:pPr>
-        <ns0:spacing ns0:after="60"/>
-        <ns0:ind ns0:left="720"/>
-      </ns0:pPr>
-      <ns0:r>
-        <ns0:t>- Literatura e evidencias sobre uso de IA generativa na educacao e economia de tempo docente.</ns0:t>
       </ns0:r>
     </ns0:p>
     <ns0:sectPr>

</xml_diff>